<commit_message>
Java 3.7 "Arreglos Actas y Planeacion de Cambios para la BD"
</commit_message>
<xml_diff>
--- a/backend/src/main/resources/plantillas/ActaFormateoSeguro.docx
+++ b/backend/src/main/resources/plantillas/ActaFormateoSeguro.docx
@@ -560,21 +560,7 @@
               <w:rPr>
                 <w:rFonts w:ascii="Times New Roman"/>
               </w:rPr>
-              <w:t>{{</w:t>
-            </w:r>
-            <w:proofErr w:type="spellStart"/>
-            <w:r>
-              <w:rPr>
-                <w:rFonts w:ascii="Times New Roman"/>
-              </w:rPr>
-              <w:t>dia</w:t>
-            </w:r>
-            <w:proofErr w:type="spellEnd"/>
-            <w:r>
-              <w:rPr>
-                <w:rFonts w:ascii="Times New Roman"/>
-              </w:rPr>
-              <w:t>}</w:t>
+              <w:t>{{dia}</w:t>
             </w:r>
             <w:r>
               <w:rPr>
@@ -623,7 +609,6 @@
               </w:rPr>
               <w:t>{{</w:t>
             </w:r>
-            <w:proofErr w:type="spellStart"/>
             <w:r>
               <w:rPr>
                 <w:rFonts w:ascii="Times New Roman"/>
@@ -645,7 +630,6 @@
               </w:rPr>
               <w:t>o</w:t>
             </w:r>
-            <w:proofErr w:type="spellEnd"/>
             <w:r>
               <w:rPr>
                 <w:rFonts w:ascii="Times New Roman"/>
@@ -677,26 +661,20 @@
             <w:r>
               <w:rPr>
                 <w:b/>
-                <w:w w:val="80"/>
-                <w:sz w:val="20"/>
-              </w:rPr>
-              <w:t>Entregado</w:t>
-            </w:r>
-            <w:r>
-              <w:rPr>
-                <w:b/>
-                <w:sz w:val="20"/>
-              </w:rPr>
-              <w:t xml:space="preserve"> </w:t>
-            </w:r>
-            <w:r>
-              <w:rPr>
-                <w:b/>
                 <w:spacing w:val="-5"/>
                 <w:w w:val="90"/>
                 <w:sz w:val="20"/>
               </w:rPr>
-              <w:t>a:</w:t>
+              <w:t>Recibido por</w:t>
+            </w:r>
+            <w:r>
+              <w:rPr>
+                <w:b/>
+                <w:spacing w:val="-5"/>
+                <w:w w:val="90"/>
+                <w:sz w:val="20"/>
+              </w:rPr>
+              <w:t>:</w:t>
             </w:r>
           </w:p>
         </w:tc>
@@ -719,21 +697,7 @@
               <w:rPr>
                 <w:rFonts w:ascii="Times New Roman"/>
               </w:rPr>
-              <w:t>{{</w:t>
-            </w:r>
-            <w:proofErr w:type="spellStart"/>
-            <w:r>
-              <w:rPr>
-                <w:rFonts w:ascii="Times New Roman"/>
-              </w:rPr>
-              <w:t>entregado_a</w:t>
-            </w:r>
-            <w:proofErr w:type="spellEnd"/>
-            <w:r>
-              <w:rPr>
-                <w:rFonts w:ascii="Times New Roman"/>
-              </w:rPr>
-              <w:t>}}</w:t>
+              <w:t>{{entregado_a}}</w:t>
             </w:r>
             <w:bookmarkEnd w:id="0"/>
           </w:p>
@@ -780,21 +744,7 @@
               <w:rPr>
                 <w:rFonts w:ascii="Times New Roman"/>
               </w:rPr>
-              <w:t>{{</w:t>
-            </w:r>
-            <w:proofErr w:type="spellStart"/>
-            <w:r>
-              <w:rPr>
-                <w:rFonts w:ascii="Times New Roman"/>
-              </w:rPr>
-              <w:t>cargo_recibe</w:t>
-            </w:r>
-            <w:proofErr w:type="spellEnd"/>
-            <w:r>
-              <w:rPr>
-                <w:rFonts w:ascii="Times New Roman"/>
-              </w:rPr>
-              <w:t>}}</w:t>
+              <w:t>{{cargo_recibe}}</w:t>
             </w:r>
           </w:p>
         </w:tc>
@@ -861,21 +811,7 @@
               <w:rPr>
                 <w:rFonts w:ascii="Times New Roman"/>
               </w:rPr>
-              <w:t>{{</w:t>
-            </w:r>
-            <w:proofErr w:type="spellStart"/>
-            <w:r>
-              <w:rPr>
-                <w:rFonts w:ascii="Times New Roman"/>
-              </w:rPr>
-              <w:t>entregado_por</w:t>
-            </w:r>
-            <w:proofErr w:type="spellEnd"/>
-            <w:r>
-              <w:rPr>
-                <w:rFonts w:ascii="Times New Roman"/>
-              </w:rPr>
-              <w:t>}}</w:t>
+              <w:t>{{entregado_por}}</w:t>
             </w:r>
           </w:p>
         </w:tc>
@@ -921,21 +857,7 @@
               <w:rPr>
                 <w:rFonts w:ascii="Times New Roman"/>
               </w:rPr>
-              <w:t>{{</w:t>
-            </w:r>
-            <w:proofErr w:type="spellStart"/>
-            <w:r>
-              <w:rPr>
-                <w:rFonts w:ascii="Times New Roman"/>
-              </w:rPr>
-              <w:t>cargo_entrega</w:t>
-            </w:r>
-            <w:proofErr w:type="spellEnd"/>
-            <w:r>
-              <w:rPr>
-                <w:rFonts w:ascii="Times New Roman"/>
-              </w:rPr>
-              <w:t>}}</w:t>
+              <w:t>{{cargo_entrega}}</w:t>
             </w:r>
           </w:p>
         </w:tc>
@@ -2656,21 +2578,7 @@
               <w:rPr>
                 <w:rFonts w:ascii="Times New Roman"/>
               </w:rPr>
-              <w:t>{{</w:t>
-            </w:r>
-            <w:proofErr w:type="spellStart"/>
-            <w:r>
-              <w:rPr>
-                <w:rFonts w:ascii="Times New Roman"/>
-              </w:rPr>
-              <w:t>firma_tecnico</w:t>
-            </w:r>
-            <w:proofErr w:type="spellEnd"/>
-            <w:r>
-              <w:rPr>
-                <w:rFonts w:ascii="Times New Roman"/>
-              </w:rPr>
-              <w:t>}}</w:t>
+              <w:t>{{firma_tecnico}}</w:t>
             </w:r>
           </w:p>
         </w:tc>
@@ -2691,21 +2599,7 @@
               <w:rPr>
                 <w:rFonts w:ascii="Times New Roman"/>
               </w:rPr>
-              <w:t>{{</w:t>
-            </w:r>
-            <w:proofErr w:type="spellStart"/>
-            <w:r>
-              <w:rPr>
-                <w:rFonts w:ascii="Times New Roman"/>
-              </w:rPr>
-              <w:t>firma_usuario</w:t>
-            </w:r>
-            <w:proofErr w:type="spellEnd"/>
-            <w:r>
-              <w:rPr>
-                <w:rFonts w:ascii="Times New Roman"/>
-              </w:rPr>
-              <w:t>}}</w:t>
+              <w:t>{{firma_usuario}}</w:t>
             </w:r>
           </w:p>
         </w:tc>
@@ -2727,21 +2621,7 @@
               <w:rPr>
                 <w:rFonts w:ascii="Times New Roman"/>
               </w:rPr>
-              <w:t>{{</w:t>
-            </w:r>
-            <w:proofErr w:type="spellStart"/>
-            <w:r>
-              <w:rPr>
-                <w:rFonts w:ascii="Times New Roman"/>
-              </w:rPr>
-              <w:t>foto_usuario</w:t>
-            </w:r>
-            <w:proofErr w:type="spellEnd"/>
-            <w:r>
-              <w:rPr>
-                <w:rFonts w:ascii="Times New Roman"/>
-              </w:rPr>
-              <w:t>}}</w:t>
+              <w:t>{{foto_usuario}}</w:t>
             </w:r>
           </w:p>
         </w:tc>
@@ -2782,18 +2662,32 @@
                 <w:sz w:val="24"/>
                 <w:szCs w:val="24"/>
               </w:rPr>
-              <w:t>: {{</w:t>
-            </w:r>
-            <w:proofErr w:type="spellStart"/>
+              <w:t>: {{entrega</w:t>
+            </w:r>
             <w:r>
               <w:rPr>
                 <w:w w:val="80"/>
                 <w:sz w:val="24"/>
                 <w:szCs w:val="24"/>
               </w:rPr>
-              <w:t>entrega_por</w:t>
-            </w:r>
-            <w:proofErr w:type="spellEnd"/>
+              <w:t>do</w:t>
+            </w:r>
+            <w:r>
+              <w:rPr>
+                <w:w w:val="80"/>
+                <w:sz w:val="24"/>
+                <w:szCs w:val="24"/>
+              </w:rPr>
+              <w:t>_</w:t>
+            </w:r>
+            <w:r>
+              <w:rPr>
+                <w:w w:val="80"/>
+                <w:sz w:val="24"/>
+                <w:szCs w:val="24"/>
+              </w:rPr>
+              <w:t>a</w:t>
+            </w:r>
             <w:r>
               <w:rPr>
                 <w:w w:val="80"/>
@@ -2848,9 +2742,8 @@
                 <w:sz w:val="24"/>
                 <w:szCs w:val="24"/>
               </w:rPr>
-              <w:t>{{</w:t>
-            </w:r>
-            <w:proofErr w:type="spellStart"/>
+              <w:t>{{entregado_</w:t>
+            </w:r>
             <w:r>
               <w:rPr>
                 <w:spacing w:val="-2"/>
@@ -2858,9 +2751,8 @@
                 <w:sz w:val="24"/>
                 <w:szCs w:val="24"/>
               </w:rPr>
-              <w:t>entregado_a</w:t>
-            </w:r>
-            <w:proofErr w:type="spellEnd"/>
+              <w:t>por</w:t>
+            </w:r>
             <w:r>
               <w:rPr>
                 <w:spacing w:val="-2"/>
@@ -2923,18 +2815,16 @@
                 <w:sz w:val="24"/>
                 <w:szCs w:val="24"/>
               </w:rPr>
-              <w:t>: {{</w:t>
-            </w:r>
-            <w:proofErr w:type="spellStart"/>
+              <w:t>: {{cargo_</w:t>
+            </w:r>
             <w:r>
               <w:rPr>
                 <w:w w:val="80"/>
                 <w:sz w:val="24"/>
                 <w:szCs w:val="24"/>
               </w:rPr>
-              <w:t>cargo_entrega</w:t>
-            </w:r>
-            <w:proofErr w:type="spellEnd"/>
+              <w:t xml:space="preserve">recibe </w:t>
+            </w:r>
             <w:r>
               <w:rPr>
                 <w:w w:val="80"/>
@@ -2971,18 +2861,16 @@
                 <w:sz w:val="24"/>
                 <w:szCs w:val="24"/>
               </w:rPr>
-              <w:t>: {{</w:t>
-            </w:r>
-            <w:proofErr w:type="spellStart"/>
+              <w:t>: {{cargo_</w:t>
+            </w:r>
             <w:r>
               <w:rPr>
                 <w:w w:val="80"/>
                 <w:sz w:val="24"/>
                 <w:szCs w:val="24"/>
               </w:rPr>
-              <w:t>cargo_recibe</w:t>
-            </w:r>
-            <w:proofErr w:type="spellEnd"/>
+              <w:t>entrega</w:t>
+            </w:r>
             <w:r>
               <w:rPr>
                 <w:w w:val="80"/>

</xml_diff>